<commit_message>
Avisame cuando llegue/Sueles pedir
</commit_message>
<xml_diff>
--- a/Para el cliente/TuStockApp_Funcionalidades_para_Distribuidoras.docx
+++ b/Para el cliente/TuStockApp_Funcionalidades_para_Distribuidoras.docx
@@ -2694,6 +2694,126 @@
                 <w:sz w:val="21"/>
               </w:rPr>
               <w:t>Si un producto tiene una promoción activa (por ejemplo, un regalo que la marca le da a tu distribuidora), la ven resaltada junto al producto en el catálogo. Si activaron las notificaciones, también reciben un aviso en el celular apenas la promoción arranca.</w:t>
+            </w:r>
+          </w:p>
+        </w:tc>
+      </w:tr>
+      <w:tr>
+        <w:tc>
+          <w:tcPr>
+            <w:tcW w:type="dxa" w:w="2950"/>
+            <w:tcBorders>
+              <w:top w:val="single" w:color="D1D5DB" w:sz="2"/>
+              <w:left w:val="single" w:color="D1D5DB" w:sz="2"/>
+              <w:bottom w:val="single" w:color="D1D5DB" w:sz="2"/>
+              <w:right w:val="single" w:color="D1D5DB" w:sz="2"/>
+            </w:tcBorders>
+            <w:tcMar>
+              <w:top w:type="dxa" w:w="100"/>
+              <w:left w:type="dxa" w:w="140"/>
+              <w:bottom w:type="dxa" w:w="100"/>
+              <w:right w:type="dxa" w:w="140"/>
+            </w:tcMar>
+          </w:tcPr>
+          <w:p>
+            <w:pPr>
+              <w:spacing w:line="280"/>
+            </w:pPr>
+            <w:r>
+              <w:rPr>
+                <w:b/>
+                <w:sz w:val="21"/>
+              </w:rPr>
+              <w:t>Sueles pedir (novedad)</w:t>
+            </w:r>
+          </w:p>
+        </w:tc>
+        <w:tc>
+          <w:tcPr>
+            <w:tcW w:type="dxa" w:w="6890"/>
+            <w:tcBorders>
+              <w:top w:val="single" w:color="D1D5DB" w:sz="2"/>
+              <w:left w:val="single" w:color="D1D5DB" w:sz="2"/>
+              <w:bottom w:val="single" w:color="D1D5DB" w:sz="2"/>
+              <w:right w:val="single" w:color="D1D5DB" w:sz="2"/>
+            </w:tcBorders>
+            <w:tcMar>
+              <w:top w:type="dxa" w:w="100"/>
+              <w:left w:type="dxa" w:w="140"/>
+              <w:bottom w:type="dxa" w:w="100"/>
+              <w:right w:type="dxa" w:w="140"/>
+            </w:tcMar>
+          </w:tcPr>
+          <w:p>
+            <w:pPr>
+              <w:spacing w:line="280"/>
+            </w:pPr>
+            <w:r>
+              <w:rPr>
+                <w:b w:val="0"/>
+                <w:sz w:val="21"/>
+              </w:rPr>
+              <w:t>Arriba del catálogo le aparece una fila con los productos que más pide, armada sola en base a su propio historial de pedidos — los agrega al carrito con un solo toque, sin tener que buscarlos de nuevo cada vez.</w:t>
+            </w:r>
+          </w:p>
+        </w:tc>
+      </w:tr>
+      <w:tr>
+        <w:tc>
+          <w:tcPr>
+            <w:tcW w:type="dxa" w:w="2950"/>
+            <w:tcBorders>
+              <w:top w:val="single" w:color="D1D5DB" w:sz="2"/>
+              <w:left w:val="single" w:color="D1D5DB" w:sz="2"/>
+              <w:bottom w:val="single" w:color="D1D5DB" w:sz="2"/>
+              <w:right w:val="single" w:color="D1D5DB" w:sz="2"/>
+            </w:tcBorders>
+            <w:tcMar>
+              <w:top w:type="dxa" w:w="100"/>
+              <w:left w:type="dxa" w:w="140"/>
+              <w:bottom w:type="dxa" w:w="100"/>
+              <w:right w:type="dxa" w:w="140"/>
+            </w:tcMar>
+          </w:tcPr>
+          <w:p>
+            <w:pPr>
+              <w:spacing w:line="280"/>
+            </w:pPr>
+            <w:r>
+              <w:rPr>
+                <w:b/>
+                <w:sz w:val="21"/>
+              </w:rPr>
+              <w:t>Avisame cuando llegue (novedad)</w:t>
+            </w:r>
+          </w:p>
+        </w:tc>
+        <w:tc>
+          <w:tcPr>
+            <w:tcW w:type="dxa" w:w="6890"/>
+            <w:tcBorders>
+              <w:top w:val="single" w:color="D1D5DB" w:sz="2"/>
+              <w:left w:val="single" w:color="D1D5DB" w:sz="2"/>
+              <w:bottom w:val="single" w:color="D1D5DB" w:sz="2"/>
+              <w:right w:val="single" w:color="D1D5DB" w:sz="2"/>
+            </w:tcBorders>
+            <w:tcMar>
+              <w:top w:type="dxa" w:w="100"/>
+              <w:left w:type="dxa" w:w="140"/>
+              <w:bottom w:type="dxa" w:w="100"/>
+              <w:right w:type="dxa" w:w="140"/>
+            </w:tcMar>
+          </w:tcPr>
+          <w:p>
+            <w:pPr>
+              <w:spacing w:line="280"/>
+            </w:pPr>
+            <w:r>
+              <w:rPr>
+                <w:b w:val="0"/>
+                <w:sz w:val="21"/>
+              </w:rPr>
+              <w:t>Si un producto está agotado, se puede anotar para que le avisen. En cuanto vos cargás stock de ese producto de nuevo, le llega automáticamente un aviso al celular — así no se te va a un competidor mientras esperaba.</w:t>
             </w:r>
           </w:p>
         </w:tc>

</xml_diff>

<commit_message>
Patrones de compra detectados
</commit_message>
<xml_diff>
--- a/Para el cliente/TuStockApp_Funcionalidades_para_Distribuidoras.docx
+++ b/Para el cliente/TuStockApp_Funcionalidades_para_Distribuidoras.docx
@@ -1115,6 +1115,72 @@
           </w:p>
         </w:tc>
       </w:tr>
+      <w:tr>
+        <w:tc>
+          <w:tcPr>
+            <w:tcW w:type="dxa" w:w="2950"/>
+            <w:tcBorders>
+              <w:top w:val="single" w:color="D1D5DB" w:sz="2"/>
+              <w:left w:val="single" w:color="D1D5DB" w:sz="2"/>
+              <w:bottom w:val="single" w:color="D1D5DB" w:sz="2"/>
+              <w:right w:val="single" w:color="D1D5DB" w:sz="2"/>
+            </w:tcBorders>
+            <w:tcMar>
+              <w:top w:type="dxa" w:w="100"/>
+              <w:left w:type="dxa" w:w="140"/>
+              <w:bottom w:type="dxa" w:w="100"/>
+              <w:right w:type="dxa" w:w="140"/>
+            </w:tcMar>
+          </w:tcPr>
+          <w:p>
+            <w:pPr>
+              <w:spacing w:line="280"/>
+            </w:pPr>
+            <w:r>
+              <w:rPr>
+                <w:b/>
+                <w:bCs/>
+                <w:color w:val="111827"/>
+                <w:sz w:val="20"/>
+                <w:szCs w:val="20"/>
+              </w:rPr>
+              <w:t xml:space="preserve">Patrones de compra y pedidos recurrentes (novedad)</w:t>
+            </w:r>
+          </w:p>
+        </w:tc>
+        <w:tc>
+          <w:tcPr>
+            <w:tcW w:type="dxa" w:w="6890"/>
+            <w:tcBorders>
+              <w:top w:val="single" w:color="D1D5DB" w:sz="2"/>
+              <w:left w:val="single" w:color="D1D5DB" w:sz="2"/>
+              <w:bottom w:val="single" w:color="D1D5DB" w:sz="2"/>
+              <w:right w:val="single" w:color="D1D5DB" w:sz="2"/>
+            </w:tcBorders>
+            <w:tcMar>
+              <w:top w:type="dxa" w:w="100"/>
+              <w:left w:type="dxa" w:w="140"/>
+              <w:bottom w:type="dxa" w:w="100"/>
+              <w:right w:type="dxa" w:w="140"/>
+            </w:tcMar>
+          </w:tcPr>
+          <w:p>
+            <w:pPr>
+              <w:spacing w:line="280"/>
+            </w:pPr>
+            <w:r>
+              <w:rPr>
+                <w:b w:val="false"/>
+                <w:bCs w:val="false"/>
+                <w:color w:val="374151"/>
+                <w:sz w:val="20"/>
+                <w:szCs w:val="20"/>
+              </w:rPr>
+              <w:t xml:space="preserve">En la ficha de cada cliente ves sus pedidos recurrentes configurados y, además, los patrones de compra que el sistema detectó solo del historial — cualquier producto que haya pedido 2 veces o más, aunque nunca lo haya armado como recurrente — con cada cuántos días lo suele repetir. Tenés un botón "Recordar" para avisarle por push en el momento, sin esperar a que el sistema decida que ya le toca.</w:t>
+            </w:r>
+          </w:p>
+        </w:tc>
+      </w:tr>
     </w:tbl>
     <w:p>
       <w:pPr>
@@ -1414,6 +1480,72 @@
                 <w:szCs w:val="20"/>
               </w:rPr>
               <w:t xml:space="preserve">Cuando marcás un pedido como “En proceso”, podés cargar (opcionalmente) una fecha y una hora estimada de entrega. Si las completás, tu cliente las ve reflejadas en el seguimiento de ese pedido, para que sepa cuándo esperarlo.</w:t>
+            </w:r>
+          </w:p>
+        </w:tc>
+      </w:tr>
+      <w:tr>
+        <w:tc>
+          <w:tcPr>
+            <w:tcW w:type="dxa" w:w="2950"/>
+            <w:tcBorders>
+              <w:top w:val="single" w:color="D1D5DB" w:sz="2"/>
+              <w:left w:val="single" w:color="D1D5DB" w:sz="2"/>
+              <w:bottom w:val="single" w:color="D1D5DB" w:sz="2"/>
+              <w:right w:val="single" w:color="D1D5DB" w:sz="2"/>
+            </w:tcBorders>
+            <w:tcMar>
+              <w:top w:type="dxa" w:w="100"/>
+              <w:left w:type="dxa" w:w="140"/>
+              <w:bottom w:type="dxa" w:w="100"/>
+              <w:right w:type="dxa" w:w="140"/>
+            </w:tcMar>
+          </w:tcPr>
+          <w:p>
+            <w:pPr>
+              <w:spacing w:line="280"/>
+            </w:pPr>
+            <w:r>
+              <w:rPr>
+                <w:b/>
+                <w:bCs/>
+                <w:color w:val="111827"/>
+                <w:sz w:val="20"/>
+                <w:szCs w:val="20"/>
+              </w:rPr>
+              <w:t xml:space="preserve">Aviso automático al cliente (novedad)</w:t>
+            </w:r>
+          </w:p>
+        </w:tc>
+        <w:tc>
+          <w:tcPr>
+            <w:tcW w:type="dxa" w:w="6890"/>
+            <w:tcBorders>
+              <w:top w:val="single" w:color="D1D5DB" w:sz="2"/>
+              <w:left w:val="single" w:color="D1D5DB" w:sz="2"/>
+              <w:bottom w:val="single" w:color="D1D5DB" w:sz="2"/>
+              <w:right w:val="single" w:color="D1D5DB" w:sz="2"/>
+            </w:tcBorders>
+            <w:tcMar>
+              <w:top w:type="dxa" w:w="100"/>
+              <w:left w:type="dxa" w:w="140"/>
+              <w:bottom w:type="dxa" w:w="100"/>
+              <w:right w:type="dxa" w:w="140"/>
+            </w:tcMar>
+          </w:tcPr>
+          <w:p>
+            <w:pPr>
+              <w:spacing w:line="280"/>
+            </w:pPr>
+            <w:r>
+              <w:rPr>
+                <w:b w:val="false"/>
+                <w:bCs w:val="false"/>
+                <w:color w:val="374151"/>
+                <w:sz w:val="20"/>
+                <w:szCs w:val="20"/>
+              </w:rPr>
+              <w:t xml:space="preserve">Apenas marcás un pedido como "En proceso" (con la fecha y hora estimada, si la cargaste) o "Completado", tu cliente recibe un aviso push al celular sin que vos tengas que avisarle — antes solo se enteraba si entraba a revisar "Mis Pedidos" manualmente.</w:t>
             </w:r>
           </w:p>
         </w:tc>

</xml_diff>